<commit_message>
docs: Update GENS-2101 Assignment 1 document and .DS_Store file.
</commit_message>
<xml_diff>
--- a/02_Resources/Academics/GENS-2101/Palk-Ricard_GENS2101_Assignment_1.docx
+++ b/02_Resources/Academics/GENS-2101/Palk-Ricard_GENS2101_Assignment_1.docx
@@ -42,7 +42,7 @@
         <w:jc w:val="center"/>
       </w:pPr>
       <w:r>
-        <w:t>GENS/GENV 2101: Natural Resources Management</w:t>
+        <w:t>GENS/GENV 2101</w:t>
       </w:r>
     </w:p>
     <w:p>
@@ -59,9 +59,6 @@
       </w:r>
     </w:p>
     <w:p>
-      <w:pPr>
-        <w:jc w:val="left"/>
-      </w:pPr>
       <w:r>
         <w:rPr>
           <w:b/>
@@ -82,6 +79,7 @@
     <w:p>
       <w:pPr>
         <w:spacing w:line="360" w:lineRule="auto"/>
+        <w:ind w:firstLine="720"/>
       </w:pPr>
       <w:r>
         <w:t xml:space="preserve">To me, </w:t>
@@ -115,9 +113,6 @@
       </w:r>
     </w:p>
     <w:p>
-      <w:pPr>
-        <w:jc w:val="left"/>
-      </w:pPr>
       <w:r>
         <w:rPr>
           <w:b/>
@@ -145,9 +140,6 @@
       </w:r>
     </w:p>
     <w:p>
-      <w:pPr>
-        <w:jc w:val="left"/>
-      </w:pPr>
       <w:r>
         <w:rPr>
           <w:b/>
@@ -159,6 +151,7 @@
     <w:p>
       <w:pPr>
         <w:spacing w:line="360" w:lineRule="auto"/>
+        <w:ind w:firstLine="720"/>
       </w:pPr>
       <w:r>
         <w:t xml:space="preserve">I want to be the kind of professional who acts as a bridge between these competing interests. My goal is to become an </w:t>
@@ -183,9 +176,6 @@
       </w:r>
     </w:p>
     <w:p>
-      <w:pPr>
-        <w:jc w:val="left"/>
-      </w:pPr>
       <w:r>
         <w:rPr>
           <w:b/>
@@ -197,6 +187,7 @@
     <w:p>
       <w:pPr>
         <w:spacing w:line="360" w:lineRule="auto"/>
+        <w:ind w:firstLine="720"/>
       </w:pPr>
       <w:r>
         <w:t xml:space="preserve">To move this vision forward, I need to develop much stronger capacities in </w:t>
@@ -230,9 +221,6 @@
       </w:r>
     </w:p>
     <w:p>
-      <w:pPr>
-        <w:jc w:val="left"/>
-      </w:pPr>
       <w:r>
         <w:rPr>
           <w:b/>

</xml_diff>